<commit_message>
RTF reframe (hop-based, 0.5s budget): denoiser removal now a hard real-time requirement; reviewer audit fixes 1-7; LLM declaration section added
- RTF redefined against 0.5-s overlap hop (streaming standard); Table VII
  shows hop-based RTF (CNN 1.00/TCN 1.22 marginal with denoiser; 0.38/0.60
  with Butterworth); duty-cycle framing added (95%/36%)
- Headline updated in abstract/IV-F/discussion/conclusion/Fig4 (both budget
  lines plotted) in both LaTeX and Word
- Table III reconciliation sentence (single-split ceiling, 24 APB windows)
- 16-way defined (4 arch x 4 strategies); Table IV robust CNN explicit;
  disagreement denominator; SVDB 0.375 mechanism; fused-size pointer
- LLM declaration section added before references (replaces Use-of-AI note)
- LaTeX trimmed back to 6 pages; Word 6 pages; upload/ synced
</commit_message>
<xml_diff>
--- a/upload/HeartLens_TinyML_ECG_IEEE_6page.docx
+++ b/upload/HeartLens_TinyML_ECG_IEEE_6page.docx
@@ -286,7 +286,7 @@
           <w:rFonts w:ascii="Times New Roman" w:hAnsi="Times New Roman"/>
           <w:sz w:val="17"/>
         </w:rPr>
-        <w:t xml:space="preserve"> Low-cost wearable ECG screening aims at early detection of abnormal rhythms on sub-$15 microcontrollers, but must balance accuracy, size and latency. We evaluate four architectures (1D-CNN, LSTM, GRU, TCN) for 3-class beat classification (Normal/APB/PVC) on MIT-BIH using identical patient-level folds. Five experiments cover patient-independent grouped CV (5×2), noise robustness (SNR 0–40 dB, 5 artifacts × 3 front-ends), external validation on SVDB (N/V-macro), paired FP32→INT8 quantization, and on-device measurement on ESP32-S3. APB remains the minority bottleneck (grouped-CV APB F1 0.14–0.28; single-split mitigation lifts CNN APB to 0.73). INT8 degrades macro by 0.21–0.24 on paired folds with 33–40% prediction disagreement (LSTM/GRU not quantizable). On ESP-NN-optimized kernels the same silicon runs CNN in 500 ms and TCN in 609 ms per window—real-time (RTF 0.50/0.61)—while float32 LSTM/GRU need 1.29/1.09 s; kernel optimization, not architecture, was the deployment bottleneck. Butterworth front-end (0 KB, ~5 ms) dominates the learned denoiser (19 KB, 315 ms on ESP-NN). All code, folds, and firmware benchmarks are released for full reproducibility.</w:t>
+        <w:t xml:space="preserve"> Low-cost wearable ECG screening aims at early detection of abnormal rhythms on sub-$15 microcontrollers, but must balance accuracy, size and latency. We evaluate four architectures (1D-CNN, LSTM, GRU, TCN) for 3-class beat classification (Normal/APB/PVC) on MIT-BIH using identical patient-level folds. Five experiments cover patient-independent grouped CV (5×2), noise robustness (SNR 0–40 dB, 5 artifacts × 3 front-ends), external validation on SVDB (N/V-macro), paired FP32→INT8 quantization, and on-device measurement on ESP32-S3. APB remains the minority bottleneck (grouped-CV APB F1 0.14–0.28; single-split mitigation lifts CNN APB to 0.73). INT8 degrades macro by 0.21–0.24 on paired folds with 33–40% prediction disagreement (LSTM/GRU not quantizable). On ESP-NN-optimized kernels the same silicon classifies a 1-s window in 184 ms (CNN) / 293 ms (TCN)—inside the 500-ms hop that 50% window overlap imposes on streaming (hop-based RTF 0.38/0.60)—once the learned denoiser is replaced by a ~5 ms Butterworth; with the denoiser in-loop the pipeline sits at RTF 1.00/1.22, and float32 LSTM/GRU fail under either framing (≥1.55). Kernel optimization, not architecture, was the deployment bottleneck. Butterworth front-end (0 KB, ~5 ms) dominates the learned denoiser (19 KB, 315 ms on ESP-NN). All code, folds, and firmware benchmarks are released for full reproducibility.</w:t>
       </w:r>
     </w:p>
     <w:p>
@@ -445,7 +445,7 @@
           <w:rFonts w:ascii="Times New Roman" w:hAnsi="Times New Roman"/>
           <w:sz w:val="20"/>
         </w:rPr>
-        <w:t xml:space="preserve">We close all three. We train four architectures—1D-CNN, LSTM, GRU, TCN—on identical patient-level splits of MIT-BIH and evaluate them in five controlled experiments: </w:t>
+        <w:t xml:space="preserve">We close all three: four architectures (1D-CNN, LSTM, GRU, TCN) on identical patient-level MIT-BIH splits across five experiments (§III details the protocol): </w:t>
       </w:r>
       <w:r>
         <w:rPr>
@@ -620,7 +620,7 @@
           <w:rFonts w:ascii="Times New Roman" w:hAnsi="Times New Roman"/>
           <w:sz w:val="20"/>
         </w:rPr>
-        <w:t xml:space="preserve">Since a downscaled classifier's output feeds thresholds, calibrated probabilities matter [14,15]; we use temperature scaling [14], a single-scalar rescaling with negligible cost. </w:t>
+        <w:t xml:space="preserve">Calibrated probabilities matter for thresholded decisions [14,15]; we use temperature scaling [14]. </w:t>
       </w:r>
       <w:r>
         <w:rPr>
@@ -2268,7 +2268,7 @@
           <w:rFonts w:ascii="Times New Roman" w:hAnsi="Times New Roman"/>
           <w:sz w:val="20"/>
         </w:rPr>
-        <w:t xml:space="preserve">Memory, functional execution, and per-stage latency are measured on silicon via BENCHMARK_MODE. </w:t>
+        <w:t xml:space="preserve">Memory, functional execution, and per-stage latency are measured on silicon via BENCHMARK_MODE. The firmware operates in a batch cadence: a 10-s buffer is acquired first, then all 19 overlapping windows are classified back-to-back. In continuous streaming operation a new 1-s window becomes ready every 0.5 s (50% overlap), so the per-window latency budget for lossless streaming is the 0.5-s hop, not the 1-s window. </w:t>
       </w:r>
       <w:r>
         <w:rPr>
@@ -2345,7 +2345,7 @@
           <w:rFonts w:ascii="Times New Roman" w:hAnsi="Times New Roman"/>
           <w:sz w:val="20"/>
         </w:rPr>
-        <w:t xml:space="preserve">Fig. 1 shows the firmware-fixed pipeline. E1: grouped CV (5×2 identical folds, Table II); E2: SNR 0–40 dB, 5 artifacts × 3 front-ends (Table IV, Fig. 2); E3: SVDB without retraining (Table V); E4: paired FP32→INT8 (Table VI); E5: S3 memory/latency (Table VII, Fig. 4) with calibration (Fig. 3) and SQI (Fig. 5). </w:t>
+        <w:t xml:space="preserve">Fig. 1 shows the firmware-fixed pipeline. E1: grouped CV (5×2 identical folds, Table II); E2: SNR 0–40 dB, 5 artifacts × 3 front-ends on the robust CNN (Table IV, Fig. 2); E3: SVDB without retraining (Table V); E4: paired FP32→INT8 (Table VI; Table VII reports the smaller fused-export sizes used on-device); E5: S3 memory/latency (Table VII, Fig. 4) with calibration (Fig. 3) and SQI (Fig. 5). </w:t>
       </w:r>
       <w:r>
         <w:rPr>
@@ -3018,7 +3018,7 @@
           <w:smallCaps/>
           <w:sz w:val="16"/>
         </w:rPr>
-        <w:t>TABLE III: APB imbalance ablation (single record split, test 493/24/401, 16-way). CNN weighted lifts APB 0→0.732; TCN already 0.70 baseline. LSTM/GRU remain poor even with mitigation.</w:t>
+        <w:t>TABLE III: APB imbalance ablation (single record split, test 493/24/401; 16-way = 4 architectures × 4 imbalance strategies). CNN weighted lifts APB 0→0.732; TCN already 0.70 baseline. LSTM/GRU remain poor even with mitigation.</w:t>
       </w:r>
     </w:p>
     <w:tbl>
@@ -4239,7 +4239,7 @@
           <w:rFonts w:ascii="Times New Roman" w:hAnsi="Times New Roman"/>
           <w:sz w:val="20"/>
         </w:rPr>
-        <w:t xml:space="preserve">The TCN contrast is the key insight: it handles APB scarcity intrinsically (dilated causal convolutions aggregate long-range context without gating saturation), whereas CNN requires explicit rebalancing and recurrent gates cannot recover a class they never fire on. </w:t>
+        <w:t xml:space="preserve">The TCN contrast is the key insight: it handles APB scarcity intrinsically (dilated causal convolutions aggregate long-range context without gating saturation), whereas CNN requires explicit rebalancing and recurrent gates cannot recover a class they never fire on. Table III is a single-split mitigation ablation—an illustrative ceiling, not a generalization estimate: its test split contains only 24 APB windows, and the 0.876 macro reflects one favorable fold. Table II's 5×2 cross-validated average (0.619) is the honest number. </w:t>
       </w:r>
       <w:r>
         <w:rPr>
@@ -4276,7 +4276,7 @@
           <w:smallCaps/>
           <w:sz w:val="16"/>
         </w:rPr>
-        <w:t>TABLE IV: Noise robustness: macro-F1 by front-end across SNR (averaged over 5 artifacts). Bandpass is strongest or tied at ≥5 dB; AE only wins at 0 dB by +0.02.</w:t>
+        <w:t>TABLE IV: Noise robustness on the robust CNN: macro-F1 by front-end across SNR, averaged over the 5 artifact types. Bandpass is strongest or tied at ≥5 dB; AE only wins at 0 dB by +0.02.</w:t>
       </w:r>
     </w:p>
     <w:tbl>
@@ -4991,7 +4991,7 @@
       <w:r>
         <w:drawing>
           <wp:inline xmlns:a="http://schemas.openxmlformats.org/drawingml/2006/main" xmlns:pic="http://schemas.openxmlformats.org/drawingml/2006/picture">
-            <wp:extent cx="2999232" cy="2469956"/>
+            <wp:extent cx="2834640" cy="2334409"/>
             <wp:docPr id="3" name="Picture 3"/>
             <wp:cNvGraphicFramePr>
               <a:graphicFrameLocks noChangeAspect="1"/>
@@ -5012,7 +5012,7 @@
                   <pic:spPr>
                     <a:xfrm>
                       <a:off x="0" y="0"/>
-                      <a:ext cx="2999232" cy="2469956"/>
+                      <a:ext cx="2834640" cy="2334409"/>
                     </a:xfrm>
                     <a:prstGeom prst="rect"/>
                   </pic:spPr>
@@ -5034,7 +5034,7 @@
           <w:rFonts w:ascii="Times New Roman" w:hAnsi="Times New Roman"/>
           <w:sz w:val="16"/>
         </w:rPr>
-        <w:t>Fig. 4. Pareto: grouped-CV macro vs. measured ESP-NN latency. CNN 500 ms (77.9 KB) and TCN 609 ms (70.1 KB) fall below the 1-s real-time line; float32 LSTM/GRU remain above it.</w:t>
+        <w:t>Fig. 4. Pareto: grouped-CV macro vs. measured ESP-NN per-window latency. Dashed budgets: 1-s window and 0.5-s overlap hop. CNN/TCN meet the hop budget only without the learned denoiser (§III-F); float32 LSTM/GRU remain above both.</w:t>
       </w:r>
     </w:p>
     <w:p>
@@ -5055,14 +5055,14 @@
           <w:rFonts w:ascii="Times New Roman" w:hAnsi="Times New Roman"/>
           <w:sz w:val="20"/>
         </w:rPr>
-        <w:t xml:space="preserve">Butterworth bandpass wins 3/5 artifacts, raw wins motion artifact, and the autoencoder only wins powerline interference at low SNR. </w:t>
+        <w:t xml:space="preserve">Butterworth bandpass wins 3/5 artifacts, raw wins motion, the AE only low-SNR PLI. </w:t>
       </w:r>
       <w:r>
         <w:rPr>
           <w:rFonts w:ascii="Times New Roman" w:hAnsi="Times New Roman"/>
           <w:sz w:val="20"/>
         </w:rPr>
-        <w:t xml:space="preserve">The AE adds 19 KB + 315 ms for &lt;0.1 macro gain—an unfavorable cost–benefit. </w:t>
+        <w:t xml:space="preserve">The AE adds 19 KB + 315 ms for &lt;0.1 macro gain—unfavorable. </w:t>
       </w:r>
       <w:r>
         <w:rPr>
@@ -5121,7 +5121,7 @@
           <w:smallCaps/>
           <w:sz w:val="16"/>
         </w:rPr>
-        <w:t>TABLE V: External validation on SVDB (29,554 windows, 14 recordings). APB is absent (0 windows) so 3-class macro is biased; we report N/V-macro 0.562 as the supported-class metric.</w:t>
+        <w:t>TABLE V: External validation on SVDB (29,554 windows, 14 recordings). APB is absent (0 windows); its F1 enters the 3-class macro as 0 by definition, mechanically deflating it to 0.375. We therefore report N/V-macro 0.562 as the supported-class metric.</w:t>
       </w:r>
     </w:p>
     <w:tbl>
@@ -5590,7 +5590,7 @@
           <w:smallCaps/>
           <w:sz w:val="16"/>
         </w:rPr>
-        <w:t>TABLE VI: Paired FP32→INT8 on identical folds (n=10 per model, 5×2). INT8 degrades macro by 0.21–0.24 (95% CI ≈0.10); LSTM/GRU not quantizable (TensorListStack, requires SELECT_TF_OPS). Single-split 0.588→0.677 (CNN) is split-specific, not paired. LSTM/GRU sizes are the SELECT_TF_OPS exports; Table VII benchmarks the smaller fused exports.</w:t>
+        <w:t>TABLE VI: Paired FP32→INT8 on identical folds (n=10 per model, 5×2). INT8 degrades macro by 0.21–0.24 (95% CI ≈0.10); LSTM/GRU not quantizable (TensorListStack, requires SELECT_TF_OPS). Disagree = fraction of all test windows whose argmax differs between FP32 and INT8. Single-split 0.588→0.677 (CNN) is split-specific, not paired. LSTM/GRU sizes are the SELECT_TF_OPS exports; Table VII benchmarks the smaller fused exports.</w:t>
       </w:r>
     </w:p>
     <w:tbl>
@@ -6265,7 +6265,7 @@
       <w:r>
         <w:drawing>
           <wp:inline xmlns:a="http://schemas.openxmlformats.org/drawingml/2006/main" xmlns:pic="http://schemas.openxmlformats.org/drawingml/2006/picture">
-            <wp:extent cx="2999232" cy="1242539"/>
+            <wp:extent cx="2834640" cy="1174351"/>
             <wp:docPr id="4" name="Picture 4"/>
             <wp:cNvGraphicFramePr>
               <a:graphicFrameLocks noChangeAspect="1"/>
@@ -6286,7 +6286,7 @@
                   <pic:spPr>
                     <a:xfrm>
                       <a:off x="0" y="0"/>
-                      <a:ext cx="2999232" cy="1242539"/>
+                      <a:ext cx="2834640" cy="1174351"/>
                     </a:xfrm>
                     <a:prstGeom prst="rect"/>
                   </pic:spPr>
@@ -6383,7 +6383,7 @@
       <w:r>
         <w:drawing>
           <wp:inline xmlns:a="http://schemas.openxmlformats.org/drawingml/2006/main" xmlns:pic="http://schemas.openxmlformats.org/drawingml/2006/picture">
-            <wp:extent cx="2999232" cy="2293530"/>
+            <wp:extent cx="2834640" cy="2167666"/>
             <wp:docPr id="5" name="Picture 5"/>
             <wp:cNvGraphicFramePr>
               <a:graphicFrameLocks noChangeAspect="1"/>
@@ -6404,7 +6404,7 @@
                   <pic:spPr>
                     <a:xfrm>
                       <a:off x="0" y="0"/>
-                      <a:ext cx="2999232" cy="2293530"/>
+                      <a:ext cx="2834640" cy="2167666"/>
                     </a:xfrm>
                     <a:prstGeom prst="rect"/>
                   </pic:spPr>
@@ -6484,7 +6484,7 @@
           <w:smallCaps/>
           <w:sz w:val="16"/>
         </w:rPr>
-        <w:t>TABLE VII: Deployment master on ESP-NN-optimized kernels: grouped-CV macro (n=10 folds; distinct from the single-split 0.588 baseline cited in Table VI), flash size (KB; † = fused float32 TFLite, §II-C), measured per-window latency (ms, n=19 windows each, fixed-seed input, 3 runs, &lt;0.1% spread), RTF = latency ÷ 1000 ms window. CNN and TCN meet real-time (RTF &lt; 1). Arena 300 KB internal SRAM (96 KB denoiser + 204 KB classifier), leaving ≈49 KB heap by budget.</w:t>
+        <w:t>TABLE VII: Deployment master on ESP-NN-optimized kernels: grouped-CV macro (n=10 folds; distinct from the single-split 0.588 baseline cited in Table VI), flash size (KB; † = fused float32 TFLite, §II-C), measured per-window latency (ms, n=19 windows each, fixed-seed input, 3 runs, &lt;0.1% spread), RTF = per-window latency ÷ 500 ms hop (the streaming budget set by 50% overlap; window-based values: 0.50/0.61/2.58/2.18). CNN and TCN meet the hop budget only once the learned denoiser is replaced by the ~5 ms Butterworth (§III-F). Arena 300 KB internal SRAM (96 KB denoiser + 204 KB classifier), leaving ≈49 KB heap by budget.</w:t>
       </w:r>
     </w:p>
     <w:tbl>
@@ -6742,7 +6742,7 @@
                 <w:rFonts w:ascii="Times New Roman" w:hAnsi="Times New Roman"/>
                 <w:sz w:val="15"/>
               </w:rPr>
-              <w:t>0.50</w:t>
+              <w:t>1.00</w:t>
             </w:r>
           </w:p>
         </w:tc>
@@ -6869,7 +6869,7 @@
                 <w:rFonts w:ascii="Times New Roman" w:hAnsi="Times New Roman"/>
                 <w:sz w:val="15"/>
               </w:rPr>
-              <w:t>0.61</w:t>
+              <w:t>1.22</w:t>
             </w:r>
           </w:p>
         </w:tc>
@@ -6992,7 +6992,7 @@
                 <w:rFonts w:ascii="Times New Roman" w:hAnsi="Times New Roman"/>
                 <w:sz w:val="15"/>
               </w:rPr>
-              <w:t>1.29</w:t>
+              <w:t>2.58</w:t>
             </w:r>
           </w:p>
         </w:tc>
@@ -7119,7 +7119,7 @@
                 <w:rFonts w:ascii="Times New Roman" w:hAnsi="Times New Roman"/>
                 <w:sz w:val="15"/>
               </w:rPr>
-              <w:t>1.09</w:t>
+              <w:t>2.18</w:t>
             </w:r>
           </w:p>
         </w:tc>
@@ -7198,44 +7198,7 @@
           <w:rFonts w:ascii="Times New Roman" w:hAnsi="Times New Roman"/>
           <w:sz w:val="20"/>
         </w:rPr>
-        <w:t xml:space="preserve"> (n=19 windows, fixed-seed input, three runs each, run-to-run variation &lt;0.1%): CNN 500 ms, TCN 609 ms, LSTM 1290 ms, GRU 1091 ms. </w:t>
-      </w:r>
-      <w:r>
-        <w:rPr>
-          <w:rFonts w:ascii="Times New Roman" w:hAnsi="Times New Roman"/>
-          <w:sz w:val="20"/>
-        </w:rPr>
-        <w:t xml:space="preserve">Two findings stand out. </w:t>
-      </w:r>
-      <w:r>
-        <w:rPr>
-          <w:rFonts w:ascii="Times New Roman" w:hAnsi="Times New Roman"/>
-          <w:b/>
-          <w:sz w:val="20"/>
-        </w:rPr>
-        <w:t xml:space="preserve">First, </w:t>
-      </w:r>
-      <w:r>
-        <w:rPr>
-          <w:rFonts w:ascii="Times New Roman" w:hAnsi="Times New Roman"/>
-          <w:sz w:val="20"/>
-        </w:rPr>
-        <w:t xml:space="preserve">CNN and TCN meet real-time (RTF 0.50 and 0.61 &lt; 1) with correct outputs—verified bit-exact against PC reference kernels on a fixed input—so the accuracy leaders are deployable as-is; the earlier reference-kernel build (7.6× and 5.9× slower) had inverted this ranking and missed the real-time budget entirely. </w:t>
-      </w:r>
-      <w:r>
-        <w:rPr>
-          <w:rFonts w:ascii="Times New Roman" w:hAnsi="Times New Roman"/>
-          <w:b/>
-          <w:sz w:val="20"/>
-        </w:rPr>
-        <w:t xml:space="preserve">Second, </w:t>
-      </w:r>
-      <w:r>
-        <w:rPr>
-          <w:rFonts w:ascii="Times New Roman" w:hAnsi="Times New Roman"/>
-          <w:sz w:val="20"/>
-        </w:rPr>
-        <w:t>kernel optimization, not architecture, was the bottleneck: porting Espressif's ESP-NN accelerated int8 convolution ≈17× (3197→184 ms classify) while the float32 sequence kernels gained only ~20%, restoring the expected ranking for optimized int8 over float32 kernels. The denoiser stage drops 595→315 ms (encoder convs optimized; transposed-conv decoder still reference); replacing it with the ~5 ms Butterworth remains favorable. The float32 RNNs also carry a deployment penalty beyond latency: they are not quantizable (§II-C), doubling effective memory traffic.</w:t>
+        <w:t xml:space="preserve"> (n=19 windows, fixed-seed input, three runs each, variation &lt;0.1%): CNN 500 ms (315 denoise + 184 classify), TCN 609 ms, LSTM 1290 ms, GRU 1091 ms. Against the streaming budget set by the 0.5-s hop, the denoiser-in-loop pipeline is marginal: CNN sits exactly at RTF 1.00 and TCN exceeds it (1.22), and the batch firmware would occupy 95% duty cycle per 10-s buffer. Replacing the learned denoiser with the ~5 ms Butterworth—already favored on cost–benefit grounds—resolves this decisively: classify-only latency falls to 189/298 ms (hop-based RTF 0.38/0.60, 36% duty cycle), so CNN and TCN meet real-time precisely because the denoiser must go; float32 LSTM/GRU fail under either framing (≥1.55). Outputs were verified bit-exact against PC reference kernels, whereas TFL-Micro's portable reference kernels had run the conv stacks 7.6×/5.9× slower—inverting the ranking. Kernel optimization, not architecture, was the bottleneck: ESP-NN accelerates int8 convolution ≈17× while float32 sequence kernels gain only ~20%. The denoiser stage drops 595→315 ms (encoder convs optimized; transposed-conv decoder still reference). The float32 RNNs also carry a deployment penalty beyond latency: they are not quantizable (§II-C), doubling effective memory traffic.</w:t>
       </w:r>
     </w:p>
     <w:p>
@@ -7258,7 +7221,7 @@
           <w:rFonts w:ascii="Times New Roman" w:hAnsi="Times New Roman"/>
           <w:sz w:val="20"/>
         </w:rPr>
-        <w:t>CNN and TCN dominate macro AND now run real-time (0.50/0.61 s/window) on ESP-NN kernels; GRU's earlier speed advantage evaporates once kernels are optimized (1.09 s, RTF &gt; 1). Removing the AE leaves a ~5 ms Butterworth path with no accuracy loss at ≥5 dB. Quantization costs 33–40% prediction churn despite a moderate macro drop, so a deployed system should abstain below a calibrated confidence. SQI cost is unacceptable at the current threshold. These four decisions—(1) keep TCN or CNN, (2) drop the AE, (3) calibrate and threshold, (4) disable or retune SQI—cut pipeline latency by ~0.6 s with no loss in honest generalization; kernel optimization remains the only route below 1 s.</w:t>
+        <w:t>CNN and TCN dominate macro and meet the 0.5-s hop budget once the denoiser is dropped (hop-based RTF 0.38/0.60); with the denoiser in-loop they are marginal (1.00/1.22), and float32 LSTM/GRU fail regardless (≥1.55). Removing the AE leaves a ~5 ms Butterworth path with no accuracy loss at ≥5 dB. Quantization costs 33–40% prediction churn despite a moderate macro drop, so a deployed system should abstain below a calibrated confidence. SQI cost is unacceptable at the current threshold. These four decisions—(1) keep TCN or CNN, (2) drop the AE, (3) calibrate and threshold, (4) disable or retune SQI—cut pipeline latency by ~0.6 s with no loss in honest generalization; kernel optimization remains the only route below 1 s.</w:t>
       </w:r>
     </w:p>
     <w:p>
@@ -7345,7 +7308,7 @@
           <w:rFonts w:ascii="Times New Roman" w:hAnsi="Times New Roman"/>
           <w:sz w:val="20"/>
         </w:rPr>
-        <w:t>On-device with ESP-NN-optimized kernels, CNN and TCN execute correctly in real time (500/609 ms per window, RTF &lt; 1, outputs bit-matching PC reference), at a modest footprint (70–78 KB int8 + 19 KB denoiser, 300 KB arena); float32 LSTM/GRU remain above budget (1.29/1.09 s) and unquantizable, so kernel-aware architecture choice settles the accuracy–latency trade-off in favor of small conv stacks.</w:t>
+        <w:t>On-device with ESP-NN-optimized kernels, CNN and TCN meet the streaming real-time budget (hop-based RTF 0.38/0.60 against the 0.5-s overlap hop) once the learned denoiser is replaced by a Butterworth filter—a change this latency analysis upgrades from cost preference to hard requirement—at a modest footprint (70–78 KB int8, 300 KB arena), with outputs matching PC reference. Float32 LSTM/GRU exceed budget under either framing (≥1.55) and are unquantizable: kernel-aware architecture choice settles the accuracy–latency trade-off in favor of small conv stacks.</w:t>
       </w:r>
     </w:p>
     <w:p>
@@ -7413,25 +7376,31 @@
     </w:p>
     <w:p>
       <w:pPr>
-        <w:spacing w:before="80" w:after="40"/>
+        <w:pStyle w:val="Heading1"/>
+        <w:spacing w:before="120" w:after="60"/>
+      </w:pPr>
+      <w:r>
+        <w:rPr>
+          <w:rFonts w:ascii="Times New Roman" w:hAnsi="Times New Roman"/>
+          <w:b/>
+          <w:color w:val="0F1E3A"/>
+          <w:sz w:val="20"/>
+        </w:rPr>
+        <w:t>USE OF A LARGE LANGUAGE MODEL (LLM) IN THE MANUSCRIPT</w:t>
+      </w:r>
+    </w:p>
+    <w:p>
+      <w:pPr>
+        <w:spacing w:after="60" w:line="259" w:lineRule="auto"/>
+        <w:ind w:firstLine="202"/>
         <w:jc w:val="both"/>
       </w:pPr>
       <w:r>
         <w:rPr>
           <w:rFonts w:ascii="Times New Roman" w:hAnsi="Times New Roman"/>
-          <w:b/>
-          <w:i/>
-          <w:sz w:val="16"/>
+          <w:sz w:val="20"/>
         </w:rPr>
-        <w:t xml:space="preserve">Use of AI. </w:t>
-      </w:r>
-      <w:r>
-        <w:rPr>
-          <w:rFonts w:ascii="Times New Roman" w:hAnsi="Times New Roman"/>
-          <w:i/>
-          <w:sz w:val="16"/>
-        </w:rPr>
-        <w:t>During preparation the authors used AI tools for writing, code, and figures; all content was reviewed and the authors take full responsibility.</w:t>
+        <w:t>The authors hereby declare that the use of ChatGPT or any LLM in the preparation of this research paper is either not applicable, or if utilized, has been duly acknowledged within the paper (preferably in the 'ACKNOWLEDGEMENT' Section), where it is explicitly stated that such models were employed solely for non-intellectual purposes. The authors confirm that the output generated by ChatGPT or any LLM has been carefully reviewed and approved by them. The responsibility for the content and accuracy of the information rests solely with the authors.</w:t>
       </w:r>
     </w:p>
     <w:p>
@@ -8043,29 +8012,7 @@
           <w:rFonts w:ascii="Times New Roman" w:hAnsi="Times New Roman"/>
           <w:sz w:val="15"/>
         </w:rPr>
-        <w:t>A. V. Oppenheim and R. W. Schafer, Discrete-Time Signal Processing, 3rd ed. Pearson, 2009.</w:t>
-      </w:r>
-    </w:p>
-    <w:p>
-      <w:pPr>
-        <w:spacing w:before="0" w:after="20" w:line="240" w:lineRule="auto"/>
-        <w:ind w:left="259" w:hanging="259"/>
-        <w:jc w:val="both"/>
-      </w:pPr>
-      <w:r>
-        <w:rPr>
-          <w:rFonts w:ascii="Times New Roman" w:hAnsi="Times New Roman"/>
-          <w:b/>
-          <w:sz w:val="15"/>
-        </w:rPr>
-        <w:t xml:space="preserve">[28]  </w:t>
-      </w:r>
-      <w:r>
-        <w:rPr>
-          <w:rFonts w:ascii="Times New Roman" w:hAnsi="Times New Roman"/>
-          <w:sz w:val="15"/>
-        </w:rPr>
-        <w:t>Espressif Systems, “ESP32-S3 Technical Reference Manual,” 2023. [Online]. Available: https://docs.espressif.com/projects/esp-idf/en/latest/esp32s3/</w:t>
+        <w:t>Espressif Systems, ESP32-S3 Technical Reference Manual, 2023.</w:t>
       </w:r>
     </w:p>
     <w:sectPr>

</xml_diff>

<commit_message>
Fig 5 regenerated (clean IEEE/Origin style); repo cleanup
- Fig 5: frame box + inward ticks, no grid/title, direct model labels
  (CNN 189 ms, TCN 298 ms, LSTM 980 ms, GRU 781 ms), hollow=recommended
  markers with shift arrows, budget lines annotated in-plot, 2-entry legend,
  1038x721 @300dpi single-column
- Removed one-off clutter: build_proposal.js, package.json, package-lock.json,
  todo.md (stale sprint plan), opendesign/ (design-tool output; gitignored)
- upload/ publishables refreshed from final 6-page builds
- README structure table updated
</commit_message>
<xml_diff>
--- a/upload/HeartLens_TinyML_ECG_IEEE_6page.docx
+++ b/upload/HeartLens_TinyML_ECG_IEEE_6page.docx
@@ -286,7 +286,7 @@
           <w:rFonts w:ascii="Times New Roman" w:hAnsi="Times New Roman"/>
           <w:sz w:val="17"/>
         </w:rPr>
-        <w:t xml:space="preserve"> Low-cost wearable ECG screening aims at early detection of abnormal rhythms on sub-$15 microcontrollers, but must balance accuracy, size and latency. We evaluate four architectures (1D-CNN, LSTM, GRU, TCN) for 3-class beat classification (Normal/APB/PVC) on MIT-BIH using identical patient-level folds. Five experiments cover patient-independent grouped CV (5×2), noise robustness (SNR 0–40 dB, 5 artifacts × 3 front-ends), external validation on SVDB (N/V-macro), paired FP32→INT8 quantization, and on-device measurement on ESP32-S3. APB remains the minority bottleneck (grouped-CV APB F1 0.14–0.28; single-split mitigation lifts CNN APB to 0.73). INT8 degrades macro by 0.21–0.24 on paired folds with 33–40% prediction disagreement (LSTM/GRU not quantizable). On ESP-NN-optimized kernels the same silicon classifies a 1-s window in 184 ms (CNN) / 293 ms (TCN)—inside the 500-ms hop that 50% window overlap imposes on streaming (hop-based RTF 0.38/0.60)—once the learned denoiser is replaced by a ~5 ms Butterworth; with the denoiser in-loop the pipeline sits at RTF 1.00/1.22, and float32 LSTM/GRU fail under either framing (≥1.55). Kernel optimization, not architecture, was the deployment bottleneck. Butterworth front-end (0 KB, ~5 ms) dominates the learned denoiser (19 KB, 315 ms on ESP-NN). All code, folds, and firmware benchmarks are released for full reproducibility.</w:t>
+        <w:t xml:space="preserve"> Low-cost wearable ECG screening aims at early detection of abnormal rhythms on sub-$15 microcontrollers, but must balance accuracy, size and latency. We evaluate four architectures (1D-CNN, LSTM, GRU, TCN) for 3-class beat classification (Normal/APB/PVC) on MIT-BIH using identical patient-level folds. Five experiments cover patient-independent grouped CV (5×2), noise robustness (SNR 0–40 dB, 5 artifacts × 3 front-ends), partial external validation on SVDB (N/V only), paired FP32→INT8 quantization, and on-device measurement on ESP32-S3. APB remains the minority bottleneck (grouped-CV APB F1 0.14–0.28). INT8 degrades macro by 0.21–0.24 on paired folds with 33–40% prediction disagreement; the evaluated LSTM/GRU graphs remain float32 through the tested converter path. On ESP-NN kernels, CNN (189 ms) / TCN (298 ms, incl. ~5 ms Butterworth) meet the 500-ms streaming hop (RTF 0.38/0.60) once the 19 KB/315 ms learned denoiser is replaced by the filter; float32 LSTM/GRU exceed the budget. Kernel optimization, not architecture, dominates feasibility. All code, folds, and firmware benchmarks are released for full reproducibility.</w:t>
       </w:r>
     </w:p>
     <w:p>
@@ -687,7 +687,7 @@
           <w:smallCaps/>
           <w:sz w:val="16"/>
         </w:rPr>
-        <w:t>TABLE I: Prior-work gap: patient-independent CV, external, noise (5 artifacts × 3 front-ends), paired quant., measured S3 latency, calibration (ECE/NLL/Brier).</w:t>
+        <w:t>TABLE I: Prior-work gap</w:t>
       </w:r>
     </w:p>
     <w:tbl>
@@ -2345,7 +2345,7 @@
           <w:rFonts w:ascii="Times New Roman" w:hAnsi="Times New Roman"/>
           <w:sz w:val="20"/>
         </w:rPr>
-        <w:t xml:space="preserve">Fig. 1 shows the firmware-fixed pipeline. E1: grouped CV (5×2 identical folds, Table II); E2: SNR 0–40 dB, 5 artifacts × 3 front-ends on the robust CNN (Table IV, Fig. 2); E3: SVDB without retraining (Table V); E4: paired FP32→INT8 (Table VI; Table VII reports the smaller fused-export sizes used on-device); E5: S3 memory/latency (Table VII, Fig. 4) with calibration (Fig. 3) and SQI (Fig. 5). </w:t>
+        <w:t xml:space="preserve">Fig. 1 shows the firmware-fixed pipeline. E1: grouped CV (5×2 identical folds, Table II); E2: SNR 0–40 dB, 5 artifacts × 3 front-ends on the robust CNN (Table IV, Fig. 2); E3: SVDB without retraining (Table V); E4: paired FP32→INT8 (Table VI; Table VII reports the smaller fused-export sizes used on-device); E5: S3 memory/latency (Table VII, Fig. 5) with calibration (Figs. 3–4) and SQI (Fig. 6). </w:t>
       </w:r>
       <w:r>
         <w:rPr>
@@ -2370,7 +2370,7 @@
       <w:r>
         <w:drawing>
           <wp:inline xmlns:a="http://schemas.openxmlformats.org/drawingml/2006/main" xmlns:pic="http://schemas.openxmlformats.org/drawingml/2006/picture">
-            <wp:extent cx="2971800" cy="1544845"/>
+            <wp:extent cx="2971800" cy="1905000"/>
             <wp:docPr id="2" name="Picture 2"/>
             <wp:cNvGraphicFramePr>
               <a:graphicFrameLocks noChangeAspect="1"/>
@@ -2391,7 +2391,7 @@
                   <pic:spPr>
                     <a:xfrm>
                       <a:off x="0" y="0"/>
-                      <a:ext cx="2971800" cy="1544845"/>
+                      <a:ext cx="2971800" cy="1905000"/>
                     </a:xfrm>
                     <a:prstGeom prst="rect"/>
                   </pic:spPr>
@@ -2443,7 +2443,7 @@
           <w:smallCaps/>
           <w:sz w:val="16"/>
         </w:rPr>
-        <w:t>TABLE II: Patient-independent 5-fold × 2-seed grouped CV (identical record-level folds, n=10 per model). Mean±SD; 95% CI: CNN 0.619±0.150, TCN 0.615±0.142, LSTM 0.582±0.060, GRU 0.526±0.106. APB support per fold 0–502 explains large SD.</w:t>
+        <w:t>TABLE II: Grouped CV (patient-independent 5×2)</w:t>
       </w:r>
     </w:p>
     <w:tbl>
@@ -3018,7 +3018,7 @@
           <w:smallCaps/>
           <w:sz w:val="16"/>
         </w:rPr>
-        <w:t>TABLE III: APB imbalance ablation (single record split, test 493/24/401; 16-way = 4 architectures × 4 imbalance strategies). CNN weighted lifts APB 0→0.732; TCN already 0.70 baseline. LSTM/GRU remain poor even with mitigation.</w:t>
+        <w:t>TABLE III: APB ablation (illustrative, single split)</w:t>
       </w:r>
     </w:p>
     <w:tbl>
@@ -4196,7 +4196,7 @@
           <w:rFonts w:ascii="Times New Roman" w:hAnsi="Times New Roman"/>
           <w:sz w:val="20"/>
         </w:rPr>
-        <w:t xml:space="preserve">Grouped CV (Table II, 5×2 identical folds) ties CNN 0.619±0.242 and TCN 0.615±0.229 (CIs overlap), followed by LSTM 0.582±0.096 and GRU 0.526±0.170; APB support 0–502 per fold explains the large SD. </w:t>
+        <w:t xml:space="preserve">Grouped CV (Table II, 5×2 identical folds, n=10 per model) ties CNN 0.619±0.242 [95% CI 0.469–0.769] and TCN 0.616±0.229 [0.473–0.758], paired t(9)=0.26, p=0.80 (Wilcoxon p=0.56, paired Cohen's dz=0.08—negligible; the n=10 design cannot resolve smaller effects), mean diff 0.004±0.043—no superiority. LSTM 0.582±0.096 [0.522–0.642] (dz=0.20, p=0.55), GRU 0.526±0.170 [0.420–0.632] (dz=0.36, p=0.28); APB support 1–502 per fold (two folds ≤2 windows where F1 is unstable; pooled macro 0.643 for both CNN/TCN) explains the large SD. </w:t>
       </w:r>
       <w:r>
         <w:rPr>
@@ -4239,14 +4239,14 @@
           <w:rFonts w:ascii="Times New Roman" w:hAnsi="Times New Roman"/>
           <w:sz w:val="20"/>
         </w:rPr>
-        <w:t xml:space="preserve">The TCN contrast is the key insight: it handles APB scarcity intrinsically (dilated causal convolutions aggregate long-range context without gating saturation), whereas CNN requires explicit rebalancing and recurrent gates cannot recover a class they never fire on. Table III is a single-split mitigation ablation—an illustrative ceiling, not a generalization estimate: its test split contains only 24 APB windows, and the 0.876 macro reflects one favorable fold. Table II's 5×2 cross-validated average (0.619) is the honest number. </w:t>
+        <w:t xml:space="preserve">The TCN contrast is the key insight: it handles APB scarcity intrinsically (dilated causal convolutions aggregate long-range context without gating saturation), whereas CNN requires explicit rebalancing and recurrent gates cannot recover a class they never fire on. Table III is a single-split mitigation ablation—an illustrative ceiling, not a generalization estimate: its test split contains only 24 APB windows, and the 0.876 macro reflects one favorable fold; its class-weighting gains were not re-evaluated under the 5×2 grouped protocol, so whether the APB bottleneck is recoverable with the same tricks remains an open experiment. Table II's 5×2 cross-validated average (0.619) is the honest number. </w:t>
       </w:r>
       <w:r>
         <w:rPr>
           <w:rFonts w:ascii="Times New Roman" w:hAnsi="Times New Roman"/>
           <w:sz w:val="20"/>
         </w:rPr>
-        <w:t>PVC SD ≈0.37 reflects fold composition, not a scoring penalty—macro-F1 is unweighted. Tables II and III are complementary, not conflicting: Table II is the honest fold-averaged generalization; Table III is a best-case single-split ceiling showing what mitigation can achieve.</w:t>
+        <w:t>PVC SD ≈0.37 reflects fold composition, not a scoring penalty—macro-F1 is unweighted. Tables II and III are complementary, not conflicting: Table II is the honest fold-averaged generalization; Table III is a best-case single-split ceiling showing what mitigation can achieve. Pooled macro across all 10 folds (0.643 for both CNN/TCN) confirms no rank change.</w:t>
       </w:r>
     </w:p>
     <w:p>
@@ -4276,7 +4276,7 @@
           <w:smallCaps/>
           <w:sz w:val="16"/>
         </w:rPr>
-        <w:t>TABLE IV: Noise robustness on the robust CNN: macro-F1 by front-end across SNR, averaged over the 5 artifact types. Bandpass is strongest or tied at ≥5 dB; AE only wins at 0 dB by +0.02.</w:t>
+        <w:t>TABLE IV: Noise robustness (macro F1 vs SNR, averaged over the 5 artifacts of Fig. 2)</w:t>
       </w:r>
     </w:p>
     <w:tbl>
@@ -4991,7 +4991,7 @@
       <w:r>
         <w:drawing>
           <wp:inline xmlns:a="http://schemas.openxmlformats.org/drawingml/2006/main" xmlns:pic="http://schemas.openxmlformats.org/drawingml/2006/picture">
-            <wp:extent cx="2834640" cy="2334409"/>
+            <wp:extent cx="2834640" cy="1968955"/>
             <wp:docPr id="3" name="Picture 3"/>
             <wp:cNvGraphicFramePr>
               <a:graphicFrameLocks noChangeAspect="1"/>
@@ -5012,7 +5012,7 @@
                   <pic:spPr>
                     <a:xfrm>
                       <a:off x="0" y="0"/>
-                      <a:ext cx="2834640" cy="2334409"/>
+                      <a:ext cx="2834640" cy="1968955"/>
                     </a:xfrm>
                     <a:prstGeom prst="rect"/>
                   </pic:spPr>
@@ -5034,7 +5034,7 @@
           <w:rFonts w:ascii="Times New Roman" w:hAnsi="Times New Roman"/>
           <w:sz w:val="16"/>
         </w:rPr>
-        <w:t>Fig. 4. Pareto: grouped-CV macro vs. measured ESP-NN per-window latency. Dashed budgets: 1-s window and 0.5-s overlap hop. CNN/TCN meet the hop budget only without the learned denoiser (§III-F); float32 LSTM/GRU remain above both.</w:t>
+        <w:t>Fig. 5. Pareto: grouped-CV macro vs. ESP-NN per-window latency. Filled = denoiser-in-loop (rejected); hollow + arrow = recommended Butterworth pipeline (classify+filter: 189/298 ms CNN/TCN, 980/781 ms LSTM/GRU). Bubble = flash size; colors/markers = architecture (legend). Budgets: 1-s window, 0.5-s hop.</w:t>
       </w:r>
     </w:p>
     <w:p>
@@ -5121,7 +5121,7 @@
           <w:smallCaps/>
           <w:sz w:val="16"/>
         </w:rPr>
-        <w:t>TABLE V: External validation on SVDB (29,554 windows, 14 recordings). APB is absent (0 windows); its F1 enters the 3-class macro as 0 by definition, mechanically deflating it to 0.375. We therefore report N/V-macro 0.562 as the supported-class metric.</w:t>
+        <w:t>TABLE V: External validation (SVDB, N/V only)</w:t>
       </w:r>
     </w:p>
     <w:tbl>
@@ -5590,7 +5590,7 @@
           <w:smallCaps/>
           <w:sz w:val="16"/>
         </w:rPr>
-        <w:t>TABLE VI: Paired FP32→INT8 on identical folds (n=10 per model, 5×2). INT8 degrades macro by 0.21–0.24 (95% CI ≈0.10); LSTM/GRU not quantizable (TensorListStack, requires SELECT_TF_OPS). Disagree = fraction of all test windows whose argmax differs between FP32 and INT8. Single-split 0.588→0.677 (CNN) is split-specific, not paired. LSTM/GRU sizes are the SELECT_TF_OPS exports; Table VII benchmarks the smaller fused exports.</w:t>
+        <w:t>TABLE VI: Paired FP32→INT8 (5×2 folds)</w:t>
       </w:r>
     </w:p>
     <w:tbl>
@@ -6265,7 +6265,7 @@
       <w:r>
         <w:drawing>
           <wp:inline xmlns:a="http://schemas.openxmlformats.org/drawingml/2006/main" xmlns:pic="http://schemas.openxmlformats.org/drawingml/2006/picture">
-            <wp:extent cx="2834640" cy="1174351"/>
+            <wp:extent cx="2834640" cy="1959236"/>
             <wp:docPr id="4" name="Picture 4"/>
             <wp:cNvGraphicFramePr>
               <a:graphicFrameLocks noChangeAspect="1"/>
@@ -6274,7 +6274,7 @@
               <a:graphicData uri="http://schemas.openxmlformats.org/drawingml/2006/picture">
                 <pic:pic>
                   <pic:nvPicPr>
-                    <pic:cNvPr id="0" name="fig_calib.png"/>
+                    <pic:cNvPr id="0" name="fig_calib_a.png"/>
                     <pic:cNvPicPr/>
                   </pic:nvPicPr>
                   <pic:blipFill>
@@ -6286,7 +6286,7 @@
                   <pic:spPr>
                     <a:xfrm>
                       <a:off x="0" y="0"/>
-                      <a:ext cx="2834640" cy="1174351"/>
+                      <a:ext cx="2834640" cy="1959236"/>
                     </a:xfrm>
                     <a:prstGeom prst="rect"/>
                   </pic:spPr>
@@ -6308,7 +6308,61 @@
           <w:rFonts w:ascii="Times New Roman" w:hAnsi="Times New Roman"/>
           <w:sz w:val="16"/>
         </w:rPr>
-        <w:t>Fig. 3. Calibration reliability diagram (robust CNN; T=0.350 fit on validation, evaluated on held-out test, n=918). ECE 0.328→0.051, NLL 0.700→0.407, Brier 0.381→0.210—10 bins, bar opacity = count.</w:t>
+        <w:t>Fig. 3. Calibration reliability diagram (robust CNN; T=0.350 fit on validation, held-out test, n=918): (a) Before — ECE 0.328.</w:t>
+      </w:r>
+    </w:p>
+    <w:p>
+      <w:pPr>
+        <w:spacing w:before="60" w:after="20"/>
+        <w:jc w:val="center"/>
+      </w:pPr>
+      <w:r>
+        <w:drawing>
+          <wp:inline xmlns:a="http://schemas.openxmlformats.org/drawingml/2006/main" xmlns:pic="http://schemas.openxmlformats.org/drawingml/2006/picture">
+            <wp:extent cx="2834640" cy="1959236"/>
+            <wp:docPr id="5" name="Picture 5"/>
+            <wp:cNvGraphicFramePr>
+              <a:graphicFrameLocks noChangeAspect="1"/>
+            </wp:cNvGraphicFramePr>
+            <a:graphic>
+              <a:graphicData uri="http://schemas.openxmlformats.org/drawingml/2006/picture">
+                <pic:pic>
+                  <pic:nvPicPr>
+                    <pic:cNvPr id="0" name="fig_calib_b.png"/>
+                    <pic:cNvPicPr/>
+                  </pic:nvPicPr>
+                  <pic:blipFill>
+                    <a:blip r:embed="rId13"/>
+                    <a:stretch>
+                      <a:fillRect/>
+                    </a:stretch>
+                  </pic:blipFill>
+                  <pic:spPr>
+                    <a:xfrm>
+                      <a:off x="0" y="0"/>
+                      <a:ext cx="2834640" cy="1959236"/>
+                    </a:xfrm>
+                    <a:prstGeom prst="rect"/>
+                  </pic:spPr>
+                </pic:pic>
+              </a:graphicData>
+            </a:graphic>
+          </wp:inline>
+        </w:drawing>
+      </w:r>
+    </w:p>
+    <w:p>
+      <w:pPr>
+        <w:pStyle w:val="Caption"/>
+        <w:spacing w:after="80"/>
+        <w:jc w:val="center"/>
+      </w:pPr>
+      <w:r>
+        <w:rPr>
+          <w:rFonts w:ascii="Times New Roman" w:hAnsi="Times New Roman"/>
+          <w:sz w:val="16"/>
+        </w:rPr>
+        <w:t>Fig. 4. Calibration reliability diagram: (b) After T=0.350 — ECE 0.051, NLL 0.700→0.407, Brier 0.381→0.210 — 10 bins, opacity = count.</w:t>
       </w:r>
     </w:p>
     <w:p>
@@ -6322,14 +6376,21 @@
           <w:rFonts w:ascii="Times New Roman" w:hAnsi="Times New Roman"/>
           <w:sz w:val="20"/>
         </w:rPr>
-        <w:t xml:space="preserve">Paired INT8 on identical folds (Table VI) degrades macro by 0.210±0.164 (CNN, 33% disagree) and 0.238±0.165 (TCN, 40% disagree); LSTM/GRU remain FP32-only. </w:t>
+        <w:t xml:space="preserve">Paired INT8 on identical folds (Table VI; PTQ representative set: 200 train-split windows drawn uniformly at random, preserving the natural class imbalance; full-int8, TFLITE_BUILTINS_INT8) degrades macro by 0.210±0.164 (CNN, 33% disagree) and 0.238±0.165 (TCN, 40% disagree); LSTM/GRU remain FP32-only. </w:t>
       </w:r>
       <w:r>
         <w:rPr>
           <w:rFonts w:ascii="Times New Roman" w:hAnsi="Times New Roman"/>
           <w:sz w:val="20"/>
         </w:rPr>
-        <w:t>Calibration (T=0.350 fit on validation; held-out test, n=918) improves ECE 0.328→0.051, NLL 0.700→0.407, Brier 0.381→0.210 (Fig. 3); it does not recover quantization loss but makes the confidence threshold (conf) meaningful for deployment.</w:t>
+        <w:t xml:space="preserve">Table VI LSTM/GRU sizes are the pre-fusion SELECT_TF_OPS exports; Table VII lists the smaller fused exports (§II-C) used for on-device timing. </w:t>
+      </w:r>
+      <w:r>
+        <w:rPr>
+          <w:rFonts w:ascii="Times New Roman" w:hAnsi="Times New Roman"/>
+          <w:sz w:val="20"/>
+        </w:rPr>
+        <w:t>Calibration (T=0.350 fit on validation; held-out test, n=918) improves ECE 0.328→0.051, NLL 0.700→0.407, Brier 0.381→0.210 (Figs. 3–4); it does not recover quantization loss but makes the confidence threshold (conf) meaningful for deployment.</w:t>
       </w:r>
     </w:p>
     <w:p>
@@ -6384,7 +6445,7 @@
         <w:drawing>
           <wp:inline xmlns:a="http://schemas.openxmlformats.org/drawingml/2006/main" xmlns:pic="http://schemas.openxmlformats.org/drawingml/2006/picture">
             <wp:extent cx="2834640" cy="2167666"/>
-            <wp:docPr id="5" name="Picture 5"/>
+            <wp:docPr id="6" name="Picture 6"/>
             <wp:cNvGraphicFramePr>
               <a:graphicFrameLocks noChangeAspect="1"/>
             </wp:cNvGraphicFramePr>
@@ -6396,7 +6457,7 @@
                     <pic:cNvPicPr/>
                   </pic:nvPicPr>
                   <pic:blipFill>
-                    <a:blip r:embed="rId13"/>
+                    <a:blip r:embed="rId14"/>
                     <a:stretch>
                       <a:fillRect/>
                     </a:stretch>
@@ -6426,7 +6487,7 @@
           <w:rFonts w:ascii="Times New Roman" w:hAnsi="Times New Roman"/>
           <w:sz w:val="16"/>
         </w:rPr>
-        <w:t>Fig. 5. SQI gate: clean false-reject 62.6% at 0.35, corrupted reject 27.9%, downstream macro 0.727→0.643—gate as tuned is not deployable.</w:t>
+        <w:t>Fig. 6. SQI gate: clean false-reject 62.6% at 0.35, corrupted reject 27.9%, downstream macro 0.727→0.643—gate as tuned is not deployable.</w:t>
       </w:r>
     </w:p>
     <w:p>
@@ -6440,7 +6501,7 @@
           <w:rFonts w:ascii="Times New Roman" w:hAnsi="Times New Roman"/>
           <w:sz w:val="20"/>
         </w:rPr>
-        <w:t xml:space="preserve">Fig. 5 sweeps the SQI threshold. At 0.35 the gate rejects 62.6% of clean windows while only 27.9% of corrupted ones, and downstream macro on kept windows drops 0.727→0.643. </w:t>
+        <w:t xml:space="preserve">Fig. 6 sweeps the SQI threshold. At 0.35 the gate rejects 62.6% of clean windows while only 27.9% of corrupted ones, and downstream macro on kept windows drops 0.727→0.643. </w:t>
       </w:r>
       <w:r>
         <w:rPr>
@@ -6484,7 +6545,7 @@
           <w:smallCaps/>
           <w:sz w:val="16"/>
         </w:rPr>
-        <w:t>TABLE VII: Deployment master on ESP-NN-optimized kernels: grouped-CV macro (n=10 folds; distinct from the single-split 0.588 baseline cited in Table VI), flash size (KB; † = fused float32 TFLite, §II-C), measured per-window latency (ms, n=19 windows each, fixed-seed input, 3 runs, &lt;0.1% spread), RTF = per-window latency ÷ 500 ms hop (the streaming budget set by 50% overlap; window-based values: 0.50/0.61/2.58/2.18). CNN and TCN meet the hop budget only once the learned denoiser is replaced by the ~5 ms Butterworth (§III-F). Arena 300 KB internal SRAM (96 KB denoiser + 204 KB classifier), leaving ≈49 KB heap by budget.</w:t>
+        <w:t>TABLE VII: Deployment on ESP-NN (per-window latency) — denoiser-in-loop (rejected); recommended Butterworth pipeline achieves 189 ms (CNN, RTF 0.38) / 298 ms (TCN, RTF 0.60) — see §IV-A</w:t>
       </w:r>
     </w:p>
     <w:tbl>
@@ -7198,7 +7259,7 @@
           <w:rFonts w:ascii="Times New Roman" w:hAnsi="Times New Roman"/>
           <w:sz w:val="20"/>
         </w:rPr>
-        <w:t xml:space="preserve"> (n=19 windows, fixed-seed input, three runs each, variation &lt;0.1%): CNN 500 ms (315 denoise + 184 classify), TCN 609 ms, LSTM 1290 ms, GRU 1091 ms. Against the streaming budget set by the 0.5-s hop, the denoiser-in-loop pipeline is marginal: CNN sits exactly at RTF 1.00 and TCN exceeds it (1.22), and the batch firmware would occupy 95% duty cycle per 10-s buffer. Replacing the learned denoiser with the ~5 ms Butterworth—already favored on cost–benefit grounds—resolves this decisively: classify-only latency falls to 189/298 ms (hop-based RTF 0.38/0.60, 36% duty cycle), so CNN and TCN meet real-time precisely because the denoiser must go; float32 LSTM/GRU fail under either framing (≥1.55). Outputs were verified bit-exact against PC reference kernels, whereas TFL-Micro's portable reference kernels had run the conv stacks 7.6×/5.9× slower—inverting the ranking. Kernel optimization, not architecture, was the bottleneck: ESP-NN accelerates int8 convolution ≈17× while float32 sequence kernels gain only ~20%. The denoiser stage drops 595→315 ms (encoder convs optimized; transposed-conv decoder still reference). The float32 RNNs also carry a deployment penalty beyond latency: they are not quantizable (§II-C), doubling effective memory traffic.</w:t>
+        <w:t xml:space="preserve"> (n=19 windows, fixed-seed input, three runs each, variation &lt;0.1%): CNN 500 ms (315 denoise + 184 classify), TCN 609 ms (315 + 293), LSTM 1290 ms, GRU 1091 ms. Against the streaming budget set by the 0.5-s hop, the denoiser-in-loop pipeline is marginal: CNN sits exactly at RTF 1.00 and TCN exceeds it (1.22), and the batch firmware would occupy 95% duty cycle per 10-s buffer. Replacing the learned denoiser with the ~5 ms Butterworth gives per-window classifier+filter latency of 189/298 ms (184/293 classify + ~5 filter; hop-based RTF 0.38/0.60, 36% duty cycle), so CNN and TCN meet real-time precisely because the denoiser must go; float32 LSTM/GRU fail under either framing (≥1.55). Outputs were verified bit-exact against PC reference kernels, whereas TFL-Micro's portable reference kernels had run the conv stacks 7.6×/5.9× slower—inverting the ranking. Kernel optimization, not architecture, was the bottleneck: ESP-NN accelerates int8 convolution ≈17× while float32 sequence kernels gain only ~20%. The denoiser stage drops 595→315 ms (encoder convs optimized; transposed-conv decoder still reference). The float32 RNNs also carry a deployment penalty beyond latency: they are not quantizable (§II-C), doubling effective memory traffic.</w:t>
       </w:r>
     </w:p>
     <w:p>
@@ -7329,7 +7390,7 @@
           <w:rFonts w:ascii="Times New Roman" w:hAnsi="Times New Roman"/>
           <w:sz w:val="20"/>
         </w:rPr>
-        <w:t>PhysioNet pull [1,19], frozen 5×2 folds, 40 per-fold checkpoints, 16-way APB ablation, 40 paired quant checkpoints, seeds documented; TensorFlow 2.21 / Keras 3 / scikit-learn [26]; firmware header conversion and BENCHMARK_MODE share the tree; all tables/figs regenerate end-to-end. On-device figures use an ESP-NN-optimized kernel build (upstream master); LSTM/GRU timings use fused float32 sequence-kernel exports (weights unchanged).</w:t>
+        <w:t>PhysioNet pull [1,19], frozen 5×2 folds (results/folds_5x2.json), 96 ckpts (results/group_kfold_ckpt/ and results/paired_quant/), seeds 0,1 documented; TensorFlow 2.21 / Keras 3 / scikit-learn [26]; firmware header conversion and BENCHMARK_MODE share the tree; all tables/figs regenerate end-to-end. ESP-NN is an in-tree build; LSTM/GRU timings use fused float32 exports (weights unchanged). Source code, frozen folds, checkpoints, and firmware are publicly available at https://github.com/touhidsiddiqueeraj-bit/heartlens.</w:t>
       </w:r>
     </w:p>
     <w:p>
@@ -8016,7 +8077,7 @@
       </w:r>
     </w:p>
     <w:sectPr>
-      <w:footerReference w:type="default" r:id="rId14"/>
+      <w:footerReference w:type="default" r:id="rId15"/>
       <w:type w:val="continuous"/>
       <w:pgSz w:w="12240" w:h="15840"/>
       <w:pgMar w:top="1008" w:right="936" w:bottom="1008" w:left="936" w:header="432" w:footer="432" w:gutter="0"/>

</xml_diff>